<commit_message>
Add phase backlog checklist — sidebar widget + API + DB migration
</commit_message>
<xml_diff>
--- a/peel-and-post-project-brief-updated.docx
+++ b/peel-and-post-project-brief-updated.docx
@@ -1558,7 +1558,8 @@
           <w:sz w:val="16"/>
           <w:szCs w:val="16"/>
         </w:rPr>
-        <w:t xml:space="preserve">  api/proofs/route.ts                      — GET list, PATCH approve/revise</w:t>
+        <w:t xml:space="preserve">  api/proofs/route.ts                      — GET list, PATCH approve/revise, POST upload (studio)
+api/backlog/route.ts                     — GET/POST/PATCH/DELETE phase checklist (studio only) ← ADDED S4</w:t>
       </w:r>
       <w:r>
         <w:br/>
@@ -3446,11 +3447,11 @@
                 <w:rFonts w:ascii="Lato" w:cs="Lato" w:eastAsia="Lato" w:hAnsi="Lato"/>
                 <w:b/>
                 <w:bCs/>
-                <w:color w:val="C9A84C"/>
-                <w:sz w:val="18"/>
-                <w:szCs w:val="18"/>
-              </w:rPr>
-              <w:t xml:space="preserve">In Progress</w:t>
+                <w:color w:val="7A8C6E"/>
+                <w:sz w:val="18"/>
+                <w:szCs w:val="18"/>
+              </w:rPr>
+              <w:t xml:space="preserve">✓ Done</w:t>
             </w:r>
           </w:p>
         </w:tc>
@@ -3512,7 +3513,7 @@
                 <w:sz w:val="18"/>
                 <w:szCs w:val="18"/>
               </w:rPr>
-              <w:t xml:space="preserve">Feature 7: Automated Emails</w:t>
+              <w:t xml:space="preserve">Phase 2, Feature 1: Template Library</w:t>
             </w:r>
           </w:p>
         </w:tc>
@@ -4991,11 +4992,11 @@
                 <w:rFonts w:ascii="Lato" w:cs="Lato" w:eastAsia="Lato" w:hAnsi="Lato"/>
                 <w:b/>
                 <w:bCs/>
-                <w:color w:val="C9A84C"/>
-                <w:sz w:val="18"/>
-                <w:szCs w:val="18"/>
-              </w:rPr>
-              <w:t xml:space="preserve">Next up</w:t>
+                <w:color w:val="7A8C6E"/>
+                <w:sz w:val="18"/>
+                <w:szCs w:val="18"/>
+              </w:rPr>
+              <w:t xml:space="preserve">✓ Done</w:t>
             </w:r>
           </w:p>
         </w:tc>
@@ -6152,7 +6153,7 @@
           <w:sz w:val="24"/>
           <w:szCs w:val="24"/>
         </w:rPr>
-        <w:t xml:space="preserve">Session 4 · _______________________</w:t>
+        <w:t xml:space="preserve">Session 4 · Phase Backlog &amp; Checklist</w:t>
       </w:r>
     </w:p>
     <w:tbl>
@@ -6232,7 +6233,7 @@
                 <w:sz w:val="18"/>
                 <w:szCs w:val="18"/>
               </w:rPr>
-              <w:t xml:space="preserve">✓  (pending)</w:t>
+              <w:t xml:space="preserve">✓ Phase 1 complete (F1–F7 all done) · DB constraint fixed (paid status) · Phase backlog feature built</w:t>
             </w:r>
           </w:p>
         </w:tc>
@@ -6299,7 +6300,7 @@
                 <w:sz w:val="18"/>
                 <w:szCs w:val="18"/>
               </w:rPr>
-              <w:t xml:space="preserve">·  (pending)</w:t>
+              <w:t xml:space="preserve">· phase_backlog table (studio-only RLS) · /api/backlog (GET, POST, PATCH, DELETE) · Sidebar checklist widget with add / check-off / delete</w:t>
             </w:r>
           </w:p>
         </w:tc>
@@ -6366,7 +6367,7 @@
                 <w:sz w:val="18"/>
                 <w:szCs w:val="18"/>
               </w:rPr>
-              <w:t xml:space="preserve">→  (pending)</w:t>
+              <w:t xml:space="preserve">→ Phase 2, Feature 1: Template Library — test emails first, then proceed</w:t>
             </w:r>
           </w:p>
         </w:tc>

</xml_diff>

<commit_message>
Revert phase backlog checklist feature
Reverts commit 43806f40: sidebar widget, API route, DB migration, and brief update.

Co-Authored-By: Claude Sonnet 4.6 <noreply@anthropic.com>
</commit_message>
<xml_diff>
--- a/peel-and-post-project-brief-updated.docx
+++ b/peel-and-post-project-brief-updated.docx
@@ -1558,8 +1558,7 @@
           <w:sz w:val="16"/>
           <w:szCs w:val="16"/>
         </w:rPr>
-        <w:t xml:space="preserve">  api/proofs/route.ts                      — GET list, PATCH approve/revise, POST upload (studio)
-api/backlog/route.ts                     — GET/POST/PATCH/DELETE phase checklist (studio only) ← ADDED S4</w:t>
+        <w:t xml:space="preserve">  api/proofs/route.ts                      — GET list, PATCH approve/revise</w:t>
       </w:r>
       <w:r>
         <w:br/>
@@ -3447,11 +3446,11 @@
                 <w:rFonts w:ascii="Lato" w:cs="Lato" w:eastAsia="Lato" w:hAnsi="Lato"/>
                 <w:b/>
                 <w:bCs/>
-                <w:color w:val="7A8C6E"/>
-                <w:sz w:val="18"/>
-                <w:szCs w:val="18"/>
-              </w:rPr>
-              <w:t xml:space="preserve">✓ Done</w:t>
+                <w:color w:val="C9A84C"/>
+                <w:sz w:val="18"/>
+                <w:szCs w:val="18"/>
+              </w:rPr>
+              <w:t xml:space="preserve">In Progress</w:t>
             </w:r>
           </w:p>
         </w:tc>
@@ -3513,7 +3512,7 @@
                 <w:sz w:val="18"/>
                 <w:szCs w:val="18"/>
               </w:rPr>
-              <w:t xml:space="preserve">Phase 2, Feature 1: Template Library</w:t>
+              <w:t xml:space="preserve">Feature 7: Automated Emails</w:t>
             </w:r>
           </w:p>
         </w:tc>
@@ -4992,11 +4991,11 @@
                 <w:rFonts w:ascii="Lato" w:cs="Lato" w:eastAsia="Lato" w:hAnsi="Lato"/>
                 <w:b/>
                 <w:bCs/>
-                <w:color w:val="7A8C6E"/>
-                <w:sz w:val="18"/>
-                <w:szCs w:val="18"/>
-              </w:rPr>
-              <w:t xml:space="preserve">✓ Done</w:t>
+                <w:color w:val="C9A84C"/>
+                <w:sz w:val="18"/>
+                <w:szCs w:val="18"/>
+              </w:rPr>
+              <w:t xml:space="preserve">Next up</w:t>
             </w:r>
           </w:p>
         </w:tc>
@@ -6153,7 +6152,7 @@
           <w:sz w:val="24"/>
           <w:szCs w:val="24"/>
         </w:rPr>
-        <w:t xml:space="preserve">Session 4 · Phase Backlog &amp; Checklist</w:t>
+        <w:t xml:space="preserve">Session 4 · _______________________</w:t>
       </w:r>
     </w:p>
     <w:tbl>
@@ -6233,7 +6232,7 @@
                 <w:sz w:val="18"/>
                 <w:szCs w:val="18"/>
               </w:rPr>
-              <w:t xml:space="preserve">✓ Phase 1 complete (F1–F7 all done) · DB constraint fixed (paid status) · Phase backlog feature built</w:t>
+              <w:t xml:space="preserve">✓  (pending)</w:t>
             </w:r>
           </w:p>
         </w:tc>
@@ -6300,7 +6299,7 @@
                 <w:sz w:val="18"/>
                 <w:szCs w:val="18"/>
               </w:rPr>
-              <w:t xml:space="preserve">· phase_backlog table (studio-only RLS) · /api/backlog (GET, POST, PATCH, DELETE) · Sidebar checklist widget with add / check-off / delete</w:t>
+              <w:t xml:space="preserve">·  (pending)</w:t>
             </w:r>
           </w:p>
         </w:tc>
@@ -6367,7 +6366,7 @@
                 <w:sz w:val="18"/>
                 <w:szCs w:val="18"/>
               </w:rPr>
-              <w:t xml:space="preserve">→ Phase 2, Feature 1: Template Library — test emails first, then proceed</w:t>
+              <w:t xml:space="preserve">→  (pending)</w:t>
             </w:r>
           </w:p>
         </w:tc>

</xml_diff>